<commit_message>
Updated tips for finding right school
</commit_message>
<xml_diff>
--- a/files/Finding the right school tips.docx
+++ b/files/Finding the right school tips.docx
@@ -92,12 +92,24 @@
     <w:p/>
     <w:p>
       <w:r>
-        <w:t>I’ll save you the trouble. Here are good resources to understand how a university is like:</w:t>
-      </w:r>
-    </w:p>
-    <w:p>
-      <w:r>
-        <w:t>(Note: reading their corporate phrasing is often too vague for you to understand what they mean. You may have to dig deeper. This is why I suggest elevated schools a lot- he is good at breaking it down – literally and figuratively!)</w:t>
+        <w:t>I’ll save you</w:t>
+      </w:r>
+      <w:r>
+        <w:t xml:space="preserve"> some time</w:t>
+      </w:r>
+      <w:r>
+        <w:t>. Here are good resources to understand how a university is like:</w:t>
+      </w:r>
+    </w:p>
+    <w:p>
+      <w:r>
+        <w:t>(Note: reading their corporate phrasing is often too vague for you to understand what they mean. You may have to dig deeper. This is why I suggest elevated schools a lot- he is good at breaking it down</w:t>
+      </w:r>
+      <w:r>
+        <w:t>,</w:t>
+      </w:r>
+      <w:r>
+        <w:t xml:space="preserve"> literally and figuratively!)</w:t>
       </w:r>
     </w:p>
     <w:p/>
@@ -173,13 +185,8 @@
       </w:hyperlink>
     </w:p>
     <w:p>
-      <w:proofErr w:type="spellStart"/>
-      <w:r>
-        <w:t>Youtube</w:t>
-      </w:r>
-      <w:proofErr w:type="spellEnd"/>
-      <w:r>
-        <w:t xml:space="preserve">: </w:t>
+      <w:r>
+        <w:t xml:space="preserve">Youtube: </w:t>
       </w:r>
       <w:hyperlink r:id="rId9" w:history="1">
         <w:r>

</xml_diff>

<commit_message>
Added to high school tips
</commit_message>
<xml_diff>
--- a/files/Finding the right school tips.docx
+++ b/files/Finding the right school tips.docx
@@ -10,15 +10,7 @@
     <w:p/>
     <w:p>
       <w:r>
-        <w:t xml:space="preserve">It is important to understand WHY you actually want to get into a college- it helps a lot with </w:t>
-      </w:r>
-      <w:proofErr w:type="gramStart"/>
-      <w:r>
-        <w:t>the writing</w:t>
-      </w:r>
-      <w:proofErr w:type="gramEnd"/>
-      <w:r>
-        <w:t xml:space="preserve">! So, research, and understand the type of person they are looking for. If you aren’t, maybe you shouldn’t apply (especially if the school is competetive enough already. </w:t>
+        <w:t xml:space="preserve">It is important to understand WHY you actually want to get into a college- it helps a lot with the writing! So, research, and understand the type of person they are looking for. If you aren’t, maybe you shouldn’t apply (especially if the school is competetive enough already. </w:t>
       </w:r>
       <w:r>
         <w:rPr>
@@ -284,6 +276,35 @@
         <w:t xml:space="preserve"> </w:t>
       </w:r>
     </w:p>
+    <w:p>
+      <w:r>
+        <w:t xml:space="preserve">Day in the life: </w:t>
+      </w:r>
+      <w:hyperlink r:id="rId14" w:history="1">
+        <w:r>
+          <w:rPr>
+            <w:rStyle w:val="Hyperlink"/>
+          </w:rPr>
+          <w:t>https://www.youtube.com/watch?v=Ofwo3gBV-k8</w:t>
+        </w:r>
+      </w:hyperlink>
+      <w:r>
+        <w:t xml:space="preserve"> </w:t>
+      </w:r>
+    </w:p>
+    <w:p>
+      <w:r>
+        <w:t xml:space="preserve">Campus tour: </w:t>
+      </w:r>
+      <w:hyperlink r:id="rId15" w:history="1">
+        <w:r>
+          <w:rPr>
+            <w:rStyle w:val="Hyperlink"/>
+          </w:rPr>
+          <w:t>https://www.youtube.com/watch?v=9sSdQjvo1bM</w:t>
+        </w:r>
+      </w:hyperlink>
+    </w:p>
     <w:p/>
     <w:p>
       <w:r>
@@ -294,7 +315,7 @@
       <w:r>
         <w:t xml:space="preserve">Elevated School </w:t>
       </w:r>
-      <w:hyperlink r:id="rId14" w:history="1">
+      <w:hyperlink r:id="rId16" w:history="1">
         <w:r>
           <w:rPr>
             <w:rStyle w:val="Hyperlink"/>
@@ -310,7 +331,7 @@
       <w:r>
         <w:t xml:space="preserve">About Yale: </w:t>
       </w:r>
-      <w:hyperlink r:id="rId15" w:history="1">
+      <w:hyperlink r:id="rId17" w:history="1">
         <w:r>
           <w:rPr>
             <w:rStyle w:val="Hyperlink"/>
@@ -329,7 +350,7 @@
       <w:r>
         <w:t xml:space="preserve">Elevated School </w:t>
       </w:r>
-      <w:hyperlink r:id="rId16" w:history="1">
+      <w:hyperlink r:id="rId18" w:history="1">
         <w:r>
           <w:rPr>
             <w:rStyle w:val="Hyperlink"/>
@@ -351,7 +372,7 @@
       <w:r>
         <w:t xml:space="preserve">Elevated School </w:t>
       </w:r>
-      <w:hyperlink r:id="rId17" w:history="1">
+      <w:hyperlink r:id="rId19" w:history="1">
         <w:r>
           <w:rPr>
             <w:rStyle w:val="Hyperlink"/>
@@ -372,7 +393,7 @@
         <w:br/>
         <w:t xml:space="preserve">Elevated School </w:t>
       </w:r>
-      <w:hyperlink r:id="rId18" w:history="1">
+      <w:hyperlink r:id="rId20" w:history="1">
         <w:r>
           <w:rPr>
             <w:rStyle w:val="Hyperlink"/>
@@ -391,7 +412,7 @@
       <w:r>
         <w:t xml:space="preserve">Elevated School: </w:t>
       </w:r>
-      <w:hyperlink r:id="rId19" w:history="1">
+      <w:hyperlink r:id="rId21" w:history="1">
         <w:r>
           <w:rPr>
             <w:rStyle w:val="Hyperlink"/>
@@ -413,7 +434,7 @@
       <w:r>
         <w:t xml:space="preserve">Video blog examples: </w:t>
       </w:r>
-      <w:hyperlink r:id="rId20" w:history="1">
+      <w:hyperlink r:id="rId22" w:history="1">
         <w:r>
           <w:rPr>
             <w:rStyle w:val="Hyperlink"/>
@@ -438,7 +459,7 @@
       <w:r>
         <w:t xml:space="preserve">: </w:t>
       </w:r>
-      <w:hyperlink r:id="rId21" w:history="1">
+      <w:hyperlink r:id="rId23" w:history="1">
         <w:r>
           <w:rPr>
             <w:rStyle w:val="Hyperlink"/>
@@ -451,7 +472,7 @@
       <w:r>
         <w:t xml:space="preserve">School tour: </w:t>
       </w:r>
-      <w:hyperlink r:id="rId22" w:history="1">
+      <w:hyperlink r:id="rId24" w:history="1">
         <w:r>
           <w:rPr>
             <w:rStyle w:val="Hyperlink"/>
@@ -466,11 +487,12 @@
     <w:p/>
     <w:p>
       <w:r>
+        <w:lastRenderedPageBreak/>
         <w:t>Princeton:</w:t>
       </w:r>
     </w:p>
     <w:p>
-      <w:hyperlink r:id="rId23" w:history="1">
+      <w:hyperlink r:id="rId25" w:history="1">
         <w:r>
           <w:rPr>
             <w:rStyle w:val="Hyperlink"/>

</xml_diff>

<commit_message>
Added to college essay tips and other small additions
</commit_message>
<xml_diff>
--- a/files/Finding the right school tips.docx
+++ b/files/Finding the right school tips.docx
@@ -1,6 +1,6 @@
 
 <file path=word/document.xml><?xml version="1.0" encoding="utf-8"?>
-<w:document xmlns:wpc="http://schemas.microsoft.com/office/word/2010/wordprocessingCanvas" xmlns:cx="http://schemas.microsoft.com/office/drawing/2014/chartex" xmlns:cx1="http://schemas.microsoft.com/office/drawing/2015/9/8/chartex" xmlns:cx2="http://schemas.microsoft.com/office/drawing/2015/10/21/chartex" xmlns:cx3="http://schemas.microsoft.com/office/drawing/2016/5/9/chartex" xmlns:cx4="http://schemas.microsoft.com/office/drawing/2016/5/10/chartex" xmlns:cx5="http://schemas.microsoft.com/office/drawing/2016/5/11/chartex" xmlns:cx6="http://schemas.microsoft.com/office/drawing/2016/5/12/chartex" xmlns:cx7="http://schemas.microsoft.com/office/drawing/2016/5/13/chartex" xmlns:cx8="http://schemas.microsoft.com/office/drawing/2016/5/14/chartex" xmlns:mc="http://schemas.openxmlformats.org/markup-compatibility/2006" xmlns:aink="http://schemas.microsoft.com/office/drawing/2016/ink" xmlns:am3d="http://schemas.microsoft.com/office/drawing/2017/model3d" xmlns:o="urn:schemas-microsoft-com:office:office" xmlns:oel="http://schemas.microsoft.com/office/2019/extlst" xmlns:r="http://schemas.openxmlformats.org/officeDocument/2006/relationships" xmlns:m="http://schemas.openxmlformats.org/officeDocument/2006/math" xmlns:v="urn:schemas-microsoft-com:vml" xmlns:wp14="http://schemas.microsoft.com/office/word/2010/wordprocessingDrawing" xmlns:wp="http://schemas.openxmlformats.org/drawingml/2006/wordprocessingDrawing" xmlns:w10="urn:schemas-microsoft-com:office:word" xmlns:w="http://schemas.openxmlformats.org/wordprocessingml/2006/main" xmlns:w14="http://schemas.microsoft.com/office/word/2010/wordml" xmlns:w15="http://schemas.microsoft.com/office/word/2012/wordml" xmlns:w16cex="http://schemas.microsoft.com/office/word/2018/wordml/cex" xmlns:w16cid="http://schemas.microsoft.com/office/word/2016/wordml/cid" xmlns:w16="http://schemas.microsoft.com/office/word/2018/wordml" xmlns:w16du="http://schemas.microsoft.com/office/word/2023/wordml/word16du" xmlns:w16sdtdh="http://schemas.microsoft.com/office/word/2020/wordml/sdtdatahash" xmlns:w16se="http://schemas.microsoft.com/office/word/2015/wordml/symex" xmlns:wpg="http://schemas.microsoft.com/office/word/2010/wordprocessingGroup" xmlns:wpi="http://schemas.microsoft.com/office/word/2010/wordprocessingInk" xmlns:wne="http://schemas.microsoft.com/office/word/2006/wordml" xmlns:wps="http://schemas.microsoft.com/office/word/2010/wordprocessingShape" mc:Ignorable="w14 w15 w16se w16cid w16 w16cex w16sdtdh w16du wp14">
+<w:document xmlns:wpc="http://schemas.microsoft.com/office/word/2010/wordprocessingCanvas" xmlns:cx="http://schemas.microsoft.com/office/drawing/2014/chartex" xmlns:cx1="http://schemas.microsoft.com/office/drawing/2015/9/8/chartex" xmlns:cx2="http://schemas.microsoft.com/office/drawing/2015/10/21/chartex" xmlns:cx3="http://schemas.microsoft.com/office/drawing/2016/5/9/chartex" xmlns:cx4="http://schemas.microsoft.com/office/drawing/2016/5/10/chartex" xmlns:cx5="http://schemas.microsoft.com/office/drawing/2016/5/11/chartex" xmlns:cx6="http://schemas.microsoft.com/office/drawing/2016/5/12/chartex" xmlns:cx7="http://schemas.microsoft.com/office/drawing/2016/5/13/chartex" xmlns:cx8="http://schemas.microsoft.com/office/drawing/2016/5/14/chartex" xmlns:mc="http://schemas.openxmlformats.org/markup-compatibility/2006" xmlns:aink="http://schemas.microsoft.com/office/drawing/2016/ink" xmlns:am3d="http://schemas.microsoft.com/office/drawing/2017/model3d" xmlns:o="urn:schemas-microsoft-com:office:office" xmlns:oel="http://schemas.microsoft.com/office/2019/extlst" xmlns:r="http://schemas.openxmlformats.org/officeDocument/2006/relationships" xmlns:m="http://schemas.openxmlformats.org/officeDocument/2006/math" xmlns:v="urn:schemas-microsoft-com:vml" xmlns:wp14="http://schemas.microsoft.com/office/word/2010/wordprocessingDrawing" xmlns:wp="http://schemas.openxmlformats.org/drawingml/2006/wordprocessingDrawing" xmlns:w10="urn:schemas-microsoft-com:office:word" xmlns:w="http://schemas.openxmlformats.org/wordprocessingml/2006/main" xmlns:w14="http://schemas.microsoft.com/office/word/2010/wordml" xmlns:w15="http://schemas.microsoft.com/office/word/2012/wordml" xmlns:w16cex="http://schemas.microsoft.com/office/word/2018/wordml/cex" xmlns:w16cid="http://schemas.microsoft.com/office/word/2016/wordml/cid" xmlns:w16="http://schemas.microsoft.com/office/word/2018/wordml" xmlns:w16du="http://schemas.microsoft.com/office/word/2023/wordml/word16du" xmlns:w16sdtdh="http://schemas.microsoft.com/office/word/2020/wordml/sdtdatahash" xmlns:w16sdtfl="http://schemas.microsoft.com/office/word/2024/wordml/sdtformatlock" xmlns:w16se="http://schemas.microsoft.com/office/word/2015/wordml/symex" xmlns:wpg="http://schemas.microsoft.com/office/word/2010/wordprocessingGroup" xmlns:wpi="http://schemas.microsoft.com/office/word/2010/wordprocessingInk" xmlns:wne="http://schemas.microsoft.com/office/word/2006/wordml" xmlns:wps="http://schemas.microsoft.com/office/word/2010/wordprocessingShape" mc:Ignorable="w14 w15 w16se w16cid w16 w16cex w16sdtdh w16sdtfl w16du wp14">
   <w:body>
     <w:p>
       <w:r>
@@ -185,13 +185,8 @@
       </w:hyperlink>
     </w:p>
     <w:p>
-      <w:proofErr w:type="spellStart"/>
-      <w:r>
-        <w:t>Youtube</w:t>
-      </w:r>
-      <w:proofErr w:type="spellEnd"/>
-      <w:r>
-        <w:t xml:space="preserve">: </w:t>
+      <w:r>
+        <w:t xml:space="preserve">Youtube: </w:t>
       </w:r>
       <w:hyperlink r:id="rId9" w:history="1">
         <w:r>
@@ -304,6 +299,11 @@
           <w:t>https://www.youtube.com/watch?v=9sSdQjvo1bM</w:t>
         </w:r>
       </w:hyperlink>
+    </w:p>
+    <w:p>
+      <w:r>
+        <w:t>Get ready to argue with anyone on any topic!</w:t>
+      </w:r>
     </w:p>
     <w:p/>
     <w:p>
@@ -487,7 +487,6 @@
     <w:p/>
     <w:p>
       <w:r>
-        <w:lastRenderedPageBreak/>
         <w:t>Princeton:</w:t>
       </w:r>
     </w:p>
@@ -514,7 +513,7 @@
 </file>
 
 <file path=word/numbering.xml><?xml version="1.0" encoding="utf-8"?>
-<w:numbering xmlns:wpc="http://schemas.microsoft.com/office/word/2010/wordprocessingCanvas" xmlns:cx="http://schemas.microsoft.com/office/drawing/2014/chartex" xmlns:cx1="http://schemas.microsoft.com/office/drawing/2015/9/8/chartex" xmlns:cx2="http://schemas.microsoft.com/office/drawing/2015/10/21/chartex" xmlns:cx3="http://schemas.microsoft.com/office/drawing/2016/5/9/chartex" xmlns:cx4="http://schemas.microsoft.com/office/drawing/2016/5/10/chartex" xmlns:cx5="http://schemas.microsoft.com/office/drawing/2016/5/11/chartex" xmlns:cx6="http://schemas.microsoft.com/office/drawing/2016/5/12/chartex" xmlns:cx7="http://schemas.microsoft.com/office/drawing/2016/5/13/chartex" xmlns:cx8="http://schemas.microsoft.com/office/drawing/2016/5/14/chartex" xmlns:mc="http://schemas.openxmlformats.org/markup-compatibility/2006" xmlns:aink="http://schemas.microsoft.com/office/drawing/2016/ink" xmlns:am3d="http://schemas.microsoft.com/office/drawing/2017/model3d" xmlns:o="urn:schemas-microsoft-com:office:office" xmlns:oel="http://schemas.microsoft.com/office/2019/extlst" xmlns:r="http://schemas.openxmlformats.org/officeDocument/2006/relationships" xmlns:m="http://schemas.openxmlformats.org/officeDocument/2006/math" xmlns:v="urn:schemas-microsoft-com:vml" xmlns:wp14="http://schemas.microsoft.com/office/word/2010/wordprocessingDrawing" xmlns:wp="http://schemas.openxmlformats.org/drawingml/2006/wordprocessingDrawing" xmlns:w10="urn:schemas-microsoft-com:office:word" xmlns:w="http://schemas.openxmlformats.org/wordprocessingml/2006/main" xmlns:w14="http://schemas.microsoft.com/office/word/2010/wordml" xmlns:w15="http://schemas.microsoft.com/office/word/2012/wordml" xmlns:w16cex="http://schemas.microsoft.com/office/word/2018/wordml/cex" xmlns:w16cid="http://schemas.microsoft.com/office/word/2016/wordml/cid" xmlns:w16="http://schemas.microsoft.com/office/word/2018/wordml" xmlns:w16du="http://schemas.microsoft.com/office/word/2023/wordml/word16du" xmlns:w16sdtdh="http://schemas.microsoft.com/office/word/2020/wordml/sdtdatahash" xmlns:w16se="http://schemas.microsoft.com/office/word/2015/wordml/symex" xmlns:wpg="http://schemas.microsoft.com/office/word/2010/wordprocessingGroup" xmlns:wpi="http://schemas.microsoft.com/office/word/2010/wordprocessingInk" xmlns:wne="http://schemas.microsoft.com/office/word/2006/wordml" xmlns:wps="http://schemas.microsoft.com/office/word/2010/wordprocessingShape" mc:Ignorable="w14 w15 w16se w16cid w16 w16cex w16sdtdh w16du wp14">
+<w:numbering xmlns:wpc="http://schemas.microsoft.com/office/word/2010/wordprocessingCanvas" xmlns:cx="http://schemas.microsoft.com/office/drawing/2014/chartex" xmlns:cx1="http://schemas.microsoft.com/office/drawing/2015/9/8/chartex" xmlns:cx2="http://schemas.microsoft.com/office/drawing/2015/10/21/chartex" xmlns:cx3="http://schemas.microsoft.com/office/drawing/2016/5/9/chartex" xmlns:cx4="http://schemas.microsoft.com/office/drawing/2016/5/10/chartex" xmlns:cx5="http://schemas.microsoft.com/office/drawing/2016/5/11/chartex" xmlns:cx6="http://schemas.microsoft.com/office/drawing/2016/5/12/chartex" xmlns:cx7="http://schemas.microsoft.com/office/drawing/2016/5/13/chartex" xmlns:cx8="http://schemas.microsoft.com/office/drawing/2016/5/14/chartex" xmlns:mc="http://schemas.openxmlformats.org/markup-compatibility/2006" xmlns:aink="http://schemas.microsoft.com/office/drawing/2016/ink" xmlns:am3d="http://schemas.microsoft.com/office/drawing/2017/model3d" xmlns:o="urn:schemas-microsoft-com:office:office" xmlns:oel="http://schemas.microsoft.com/office/2019/extlst" xmlns:r="http://schemas.openxmlformats.org/officeDocument/2006/relationships" xmlns:m="http://schemas.openxmlformats.org/officeDocument/2006/math" xmlns:v="urn:schemas-microsoft-com:vml" xmlns:wp14="http://schemas.microsoft.com/office/word/2010/wordprocessingDrawing" xmlns:wp="http://schemas.openxmlformats.org/drawingml/2006/wordprocessingDrawing" xmlns:w10="urn:schemas-microsoft-com:office:word" xmlns:w="http://schemas.openxmlformats.org/wordprocessingml/2006/main" xmlns:w14="http://schemas.microsoft.com/office/word/2010/wordml" xmlns:w15="http://schemas.microsoft.com/office/word/2012/wordml" xmlns:w16cex="http://schemas.microsoft.com/office/word/2018/wordml/cex" xmlns:w16cid="http://schemas.microsoft.com/office/word/2016/wordml/cid" xmlns:w16="http://schemas.microsoft.com/office/word/2018/wordml" xmlns:w16du="http://schemas.microsoft.com/office/word/2023/wordml/word16du" xmlns:w16sdtdh="http://schemas.microsoft.com/office/word/2020/wordml/sdtdatahash" xmlns:w16sdtfl="http://schemas.microsoft.com/office/word/2024/wordml/sdtformatlock" xmlns:w16se="http://schemas.microsoft.com/office/word/2015/wordml/symex" xmlns:wpg="http://schemas.microsoft.com/office/word/2010/wordprocessingGroup" xmlns:wpi="http://schemas.microsoft.com/office/word/2010/wordprocessingInk" xmlns:wne="http://schemas.microsoft.com/office/word/2006/wordml" xmlns:wps="http://schemas.microsoft.com/office/word/2010/wordprocessingShape" mc:Ignorable="w14 w15 w16se w16cid w16 w16cex w16sdtdh w16sdtfl w16du wp14">
   <w:abstractNum w:abstractNumId="0" w15:restartNumberingAfterBreak="0">
     <w:nsid w:val="408E4EA1"/>
     <w:multiLevelType w:val="hybridMultilevel"/>
@@ -634,7 +633,7 @@
 </file>
 
 <file path=word/styles.xml><?xml version="1.0" encoding="utf-8"?>
-<w:styles xmlns:mc="http://schemas.openxmlformats.org/markup-compatibility/2006" xmlns:r="http://schemas.openxmlformats.org/officeDocument/2006/relationships" xmlns:w="http://schemas.openxmlformats.org/wordprocessingml/2006/main" xmlns:w14="http://schemas.microsoft.com/office/word/2010/wordml" xmlns:w15="http://schemas.microsoft.com/office/word/2012/wordml" xmlns:w16cex="http://schemas.microsoft.com/office/word/2018/wordml/cex" xmlns:w16cid="http://schemas.microsoft.com/office/word/2016/wordml/cid" xmlns:w16="http://schemas.microsoft.com/office/word/2018/wordml" xmlns:w16du="http://schemas.microsoft.com/office/word/2023/wordml/word16du" xmlns:w16sdtdh="http://schemas.microsoft.com/office/word/2020/wordml/sdtdatahash" xmlns:w16se="http://schemas.microsoft.com/office/word/2015/wordml/symex" mc:Ignorable="w14 w15 w16se w16cid w16 w16cex w16sdtdh w16du">
+<w:styles xmlns:mc="http://schemas.openxmlformats.org/markup-compatibility/2006" xmlns:r="http://schemas.openxmlformats.org/officeDocument/2006/relationships" xmlns:w="http://schemas.openxmlformats.org/wordprocessingml/2006/main" xmlns:w14="http://schemas.microsoft.com/office/word/2010/wordml" xmlns:w15="http://schemas.microsoft.com/office/word/2012/wordml" xmlns:w16cex="http://schemas.microsoft.com/office/word/2018/wordml/cex" xmlns:w16cid="http://schemas.microsoft.com/office/word/2016/wordml/cid" xmlns:w16="http://schemas.microsoft.com/office/word/2018/wordml" xmlns:w16du="http://schemas.microsoft.com/office/word/2023/wordml/word16du" xmlns:w16sdtdh="http://schemas.microsoft.com/office/word/2020/wordml/sdtdatahash" xmlns:w16sdtfl="http://schemas.microsoft.com/office/word/2024/wordml/sdtformatlock" xmlns:w16se="http://schemas.microsoft.com/office/word/2015/wordml/symex" mc:Ignorable="w14 w15 w16se w16cid w16 w16cex w16sdtdh w16sdtfl w16du">
   <w:docDefaults>
     <w:rPrDefault>
       <w:rPr>

</xml_diff>